<commit_message>
Adiciona pendência/boas-vindas Meta e rastreio de custo no Número B.
Confirma envio ao cliente na esteira, agenda boas-vindas ao INSTALADA e registra custo estimado por mensagem oficial.

Co-authored-by: Cursor <cursoragent@cursor.com>
</commit_message>
<xml_diff>
--- a/docs/WhatsApp_Templates_Aprovacao_Meta.docx
+++ b/docs/WhatsApp_Templates_Aprovacao_Meta.docx
@@ -26,7 +26,7 @@
           <w:color w:val="5B6B7D"/>
           <w:sz w:val="22"/>
         </w:rPr>
-        <w:t>UTILITY · Botões Quick Reply · Confirmação · Instalação · Cobrança</w:t>
+        <w:t>UTILITY · Botões Quick Reply · Confirmação · Instalação · Pendência · Boas-vindas · Cobrança</w:t>
       </w:r>
     </w:p>
     <w:p>
@@ -1762,7 +1762,7 @@
           <w:b w:val="0"/>
           <w:sz w:val="22"/>
         </w:rPr>
-        <w:t>nio_instalacao_confirmada_v1</w:t>
+        <w:t>nio_instalacao_confirmada_v1_2</w:t>
       </w:r>
     </w:p>
     <w:p>
@@ -1825,7 +1825,7 @@
           <w:b w:val="0"/>
           <w:sz w:val="22"/>
         </w:rPr>
-        <w:t>Confirmar agenda + atalhos se o cliente ainda precisar de ajuda</w:t>
+        <w:t>Confirmar agenda (continuação do lembrete — sem repetir saudação/nome)</w:t>
       </w:r>
     </w:p>
     <w:p>
@@ -1851,7 +1851,7 @@
           <w:b w:val="0"/>
           <w:sz w:val="22"/>
         </w:rPr>
-        <w:t>Olá, {{1}}!</w:t>
+        <w:t>Confirmação registrada. ✅</w:t>
       </w:r>
     </w:p>
     <w:p>
@@ -1879,7 +1879,7 @@
           <w:b w:val="0"/>
           <w:sz w:val="22"/>
         </w:rPr>
-        <w:t>{{2}},</w:t>
+        <w:t>Sua instalação Nio Fibra está confirmada para *{{1}}*,</w:t>
       </w:r>
     </w:p>
     <w:p>
@@ -1892,63 +1892,7 @@
           <w:b w:val="0"/>
           <w:sz w:val="22"/>
         </w:rPr>
-      </w:r>
-      <w:r>
-        <w:t xml:space="preserve"> </w:t>
-      </w:r>
-    </w:p>
-    <w:p>
-      <w:pPr>
-        <w:spacing w:after="0" w:before="0" w:line="240" w:lineRule="auto"/>
-      </w:pPr>
-      <w:r>
-        <w:rPr>
-          <w:rFonts w:ascii="Consolas" w:hAnsi="Consolas" w:eastAsia="Consolas"/>
-          <w:b w:val="0"/>
-          <w:sz w:val="22"/>
-        </w:rPr>
-        <w:t>Confirmação registrada. ✅</w:t>
-      </w:r>
-    </w:p>
-    <w:p>
-      <w:pPr>
-        <w:spacing w:after="0" w:before="0" w:line="240" w:lineRule="auto"/>
-      </w:pPr>
-      <w:r>
-        <w:rPr>
-          <w:rFonts w:ascii="Consolas" w:hAnsi="Consolas" w:eastAsia="Consolas"/>
-          <w:b w:val="0"/>
-          <w:sz w:val="22"/>
-        </w:rPr>
-      </w:r>
-      <w:r>
-        <w:t xml:space="preserve"> </w:t>
-      </w:r>
-    </w:p>
-    <w:p>
-      <w:pPr>
-        <w:spacing w:after="0" w:before="0" w:line="240" w:lineRule="auto"/>
-      </w:pPr>
-      <w:r>
-        <w:rPr>
-          <w:rFonts w:ascii="Consolas" w:hAnsi="Consolas" w:eastAsia="Consolas"/>
-          <w:b w:val="0"/>
-          <w:sz w:val="22"/>
-        </w:rPr>
-        <w:t>Sua instalação Nio Fibra está confirmada para *{{3}}*,</w:t>
-      </w:r>
-    </w:p>
-    <w:p>
-      <w:pPr>
-        <w:spacing w:after="0" w:before="0" w:line="240" w:lineRule="auto"/>
-      </w:pPr>
-      <w:r>
-        <w:rPr>
-          <w:rFonts w:ascii="Consolas" w:hAnsi="Consolas" w:eastAsia="Consolas"/>
-          <w:b w:val="0"/>
-          <w:sz w:val="22"/>
-        </w:rPr>
-        <w:t>das *{{4}}*.</w:t>
+        <w:t>das *{{2}}*.</w:t>
       </w:r>
     </w:p>
     <w:p>
@@ -2124,7 +2068,7 @@
           <w:b w:val="0"/>
           <w:sz w:val="22"/>
         </w:rPr>
-        <w:t>• {{1}} saudação</w:t>
+        <w:t>• {{1}} data</w:t>
       </w:r>
     </w:p>
     <w:p>
@@ -2137,33 +2081,7 @@
           <w:b w:val="0"/>
           <w:sz w:val="22"/>
         </w:rPr>
-        <w:t>• {{2}} primeiro nome</w:t>
-      </w:r>
-    </w:p>
-    <w:p>
-      <w:pPr>
-        <w:spacing w:after="40" w:before="0"/>
-      </w:pPr>
-      <w:r>
-        <w:rPr>
-          <w:rFonts w:ascii="Calibri" w:hAnsi="Calibri" w:eastAsia="Calibri"/>
-          <w:b w:val="0"/>
-          <w:sz w:val="22"/>
-        </w:rPr>
-        <w:t>• {{3}} data</w:t>
-      </w:r>
-    </w:p>
-    <w:p>
-      <w:pPr>
-        <w:spacing w:after="40" w:before="0"/>
-      </w:pPr>
-      <w:r>
-        <w:rPr>
-          <w:rFonts w:ascii="Calibri" w:hAnsi="Calibri" w:eastAsia="Calibri"/>
-          <w:b w:val="0"/>
-          <w:sz w:val="22"/>
-        </w:rPr>
-        <w:t>• {{4}} horário</w:t>
+        <w:t>• {{2}} horário</w:t>
       </w:r>
     </w:p>
     <w:p>
@@ -2177,6 +2095,19 @@
           <w:sz w:val="22"/>
         </w:rPr>
         <w:t>Notas:</w:t>
+      </w:r>
+    </w:p>
+    <w:p>
+      <w:pPr>
+        <w:spacing w:after="40" w:before="0"/>
+      </w:pPr>
+      <w:r>
+        <w:rPr>
+          <w:rFonts w:ascii="Calibri" w:hAnsi="Calibri" w:eastAsia="Calibri"/>
+          <w:b w:val="0"/>
+          <w:sz w:val="22"/>
+        </w:rPr>
+        <w:t>• Sem Olá/saudação: é resposta imediata após Confirmar no template 2.</w:t>
       </w:r>
     </w:p>
     <w:p>
@@ -3819,7 +3750,104 @@
           <w:b/>
           <w:sz w:val="32"/>
         </w:rPr>
-        <w:t>Mapa rápido — texto do botão → ação CRM</w:t>
+        <w:t>Pendência e boas-vindas (esteira)</w:t>
+      </w:r>
+    </w:p>
+    <w:p>
+      <w:pPr>
+        <w:pStyle w:val="Heading2"/>
+      </w:pPr>
+      <w:r>
+        <w:rPr>
+          <w:rFonts w:ascii="Calibri" w:hAnsi="Calibri" w:eastAsia="Calibri"/>
+          <w:b/>
+          <w:sz w:val="26"/>
+        </w:rPr>
+        <w:t>7. Pendência de agendamento (tipo Cliente)</w:t>
+      </w:r>
+    </w:p>
+    <w:p>
+      <w:pPr>
+        <w:spacing w:after="40"/>
+      </w:pPr>
+      <w:r>
+        <w:rPr>
+          <w:rFonts w:ascii="Calibri" w:hAnsi="Calibri" w:eastAsia="Calibri"/>
+          <w:b/>
+          <w:sz w:val="22"/>
+        </w:rPr>
+        <w:t xml:space="preserve">Nome sugerido: </w:t>
+      </w:r>
+      <w:r>
+        <w:rPr>
+          <w:rFonts w:ascii="Calibri" w:hAnsi="Calibri" w:eastAsia="Calibri"/>
+          <w:b w:val="0"/>
+          <w:sz w:val="22"/>
+        </w:rPr>
+        <w:t>nio_pendencia_reagendamento_v1</w:t>
+      </w:r>
+    </w:p>
+    <w:p>
+      <w:pPr>
+        <w:spacing w:after="40"/>
+      </w:pPr>
+      <w:r>
+        <w:rPr>
+          <w:rFonts w:ascii="Calibri" w:hAnsi="Calibri" w:eastAsia="Calibri"/>
+          <w:b/>
+          <w:sz w:val="22"/>
+        </w:rPr>
+        <w:t xml:space="preserve">Categoria: </w:t>
+      </w:r>
+      <w:r>
+        <w:rPr>
+          <w:rFonts w:ascii="Calibri" w:hAnsi="Calibri" w:eastAsia="Calibri"/>
+          <w:b w:val="0"/>
+          <w:sz w:val="22"/>
+        </w:rPr>
+        <w:t>UTILITY</w:t>
+      </w:r>
+    </w:p>
+    <w:p>
+      <w:pPr>
+        <w:spacing w:after="40"/>
+      </w:pPr>
+      <w:r>
+        <w:rPr>
+          <w:rFonts w:ascii="Calibri" w:hAnsi="Calibri" w:eastAsia="Calibri"/>
+          <w:b/>
+          <w:sz w:val="22"/>
+        </w:rPr>
+        <w:t xml:space="preserve">Idioma: </w:t>
+      </w:r>
+      <w:r>
+        <w:rPr>
+          <w:rFonts w:ascii="Calibri" w:hAnsi="Calibri" w:eastAsia="Calibri"/>
+          <w:b w:val="0"/>
+          <w:sz w:val="22"/>
+        </w:rPr>
+        <w:t>pt_BR</w:t>
+      </w:r>
+    </w:p>
+    <w:p>
+      <w:pPr>
+        <w:spacing w:after="40"/>
+      </w:pPr>
+      <w:r>
+        <w:rPr>
+          <w:rFonts w:ascii="Calibri" w:hAnsi="Calibri" w:eastAsia="Calibri"/>
+          <w:b/>
+          <w:sz w:val="22"/>
+        </w:rPr>
+        <w:t xml:space="preserve">Finalidade: </w:t>
+      </w:r>
+      <w:r>
+        <w:rPr>
+          <w:rFonts w:ascii="Calibri" w:hAnsi="Calibri" w:eastAsia="Calibri"/>
+          <w:b w:val="0"/>
+          <w:sz w:val="22"/>
+        </w:rPr>
+        <w:t>Avisar pendência + orientar reagendamento no canal oficial Nio</w:t>
       </w:r>
     </w:p>
     <w:p>
@@ -3829,12 +3857,244 @@
       <w:r>
         <w:rPr>
           <w:rFonts w:ascii="Calibri" w:hAnsi="Calibri" w:eastAsia="Calibri"/>
-          <w:b w:val="0"/>
-          <w:sz w:val="22"/>
-        </w:rPr>
-        <w:t>• CORRETO → avança pedido</w:t>
-      </w:r>
-    </w:p>
+          <w:b/>
+          <w:sz w:val="22"/>
+        </w:rPr>
+        <w:t>Corpo (colar no Manager — cada linha = Enter):</w:t>
+      </w:r>
+    </w:p>
+    <w:p>
+      <w:pPr>
+        <w:spacing w:after="0" w:before="0" w:line="240" w:lineRule="auto"/>
+      </w:pPr>
+      <w:r>
+        <w:rPr>
+          <w:rFonts w:ascii="Consolas" w:hAnsi="Consolas" w:eastAsia="Consolas"/>
+          <w:b w:val="0"/>
+          <w:sz w:val="22"/>
+        </w:rPr>
+        <w:t>Olá, {{1}}!</w:t>
+      </w:r>
+    </w:p>
+    <w:p>
+      <w:pPr>
+        <w:spacing w:after="0" w:before="0" w:line="240" w:lineRule="auto"/>
+      </w:pPr>
+      <w:r>
+        <w:rPr>
+          <w:rFonts w:ascii="Consolas" w:hAnsi="Consolas" w:eastAsia="Consolas"/>
+          <w:b w:val="0"/>
+          <w:sz w:val="22"/>
+        </w:rPr>
+      </w:r>
+      <w:r>
+        <w:t xml:space="preserve"> </w:t>
+      </w:r>
+    </w:p>
+    <w:p>
+      <w:pPr>
+        <w:spacing w:after="0" w:before="0" w:line="240" w:lineRule="auto"/>
+      </w:pPr>
+      <w:r>
+        <w:rPr>
+          <w:rFonts w:ascii="Consolas" w:hAnsi="Consolas" w:eastAsia="Consolas"/>
+          <w:b w:val="0"/>
+          <w:sz w:val="22"/>
+        </w:rPr>
+        <w:t>{{2}},</w:t>
+      </w:r>
+    </w:p>
+    <w:p>
+      <w:pPr>
+        <w:spacing w:after="0" w:before="0" w:line="240" w:lineRule="auto"/>
+      </w:pPr>
+      <w:r>
+        <w:rPr>
+          <w:rFonts w:ascii="Consolas" w:hAnsi="Consolas" w:eastAsia="Consolas"/>
+          <w:b w:val="0"/>
+          <w:sz w:val="22"/>
+        </w:rPr>
+      </w:r>
+      <w:r>
+        <w:t xml:space="preserve"> </w:t>
+      </w:r>
+    </w:p>
+    <w:p>
+      <w:pPr>
+        <w:spacing w:after="0" w:before="0" w:line="240" w:lineRule="auto"/>
+      </w:pPr>
+      <w:r>
+        <w:rPr>
+          <w:rFonts w:ascii="Consolas" w:hAnsi="Consolas" w:eastAsia="Consolas"/>
+          <w:b w:val="0"/>
+          <w:sz w:val="22"/>
+        </w:rPr>
+        <w:t>Parceiro oficial da Nio Fibra.</w:t>
+      </w:r>
+    </w:p>
+    <w:p>
+      <w:pPr>
+        <w:spacing w:after="0" w:before="0" w:line="240" w:lineRule="auto"/>
+      </w:pPr>
+      <w:r>
+        <w:rPr>
+          <w:rFonts w:ascii="Consolas" w:hAnsi="Consolas" w:eastAsia="Consolas"/>
+          <w:b w:val="0"/>
+          <w:sz w:val="22"/>
+        </w:rPr>
+        <w:t>Identificamos uma pendência no agendamento</w:t>
+      </w:r>
+    </w:p>
+    <w:p>
+      <w:pPr>
+        <w:spacing w:after="0" w:before="0" w:line="240" w:lineRule="auto"/>
+      </w:pPr>
+      <w:r>
+        <w:rPr>
+          <w:rFonts w:ascii="Consolas" w:hAnsi="Consolas" w:eastAsia="Consolas"/>
+          <w:b w:val="0"/>
+          <w:sz w:val="22"/>
+        </w:rPr>
+        <w:t>da sua instalação Nio Fibra.</w:t>
+      </w:r>
+    </w:p>
+    <w:p>
+      <w:pPr>
+        <w:spacing w:after="0" w:before="0" w:line="240" w:lineRule="auto"/>
+      </w:pPr>
+      <w:r>
+        <w:rPr>
+          <w:rFonts w:ascii="Consolas" w:hAnsi="Consolas" w:eastAsia="Consolas"/>
+          <w:b w:val="0"/>
+          <w:sz w:val="22"/>
+        </w:rPr>
+        <w:t>Na maioria dos casos isso não depende de você.</w:t>
+      </w:r>
+    </w:p>
+    <w:p>
+      <w:pPr>
+        <w:spacing w:after="0" w:before="0" w:line="240" w:lineRule="auto"/>
+      </w:pPr>
+      <w:r>
+        <w:rPr>
+          <w:rFonts w:ascii="Consolas" w:hAnsi="Consolas" w:eastAsia="Consolas"/>
+          <w:b w:val="0"/>
+          <w:sz w:val="22"/>
+        </w:rPr>
+      </w:r>
+      <w:r>
+        <w:t xml:space="preserve"> </w:t>
+      </w:r>
+    </w:p>
+    <w:p>
+      <w:pPr>
+        <w:spacing w:after="0" w:before="0" w:line="240" w:lineRule="auto"/>
+      </w:pPr>
+      <w:r>
+        <w:rPr>
+          <w:rFonts w:ascii="Consolas" w:hAnsi="Consolas" w:eastAsia="Consolas"/>
+          <w:b w:val="0"/>
+          <w:sz w:val="22"/>
+        </w:rPr>
+        <w:t>Para reagendar, entre em contato pelo</w:t>
+      </w:r>
+    </w:p>
+    <w:p>
+      <w:pPr>
+        <w:spacing w:after="0" w:before="0" w:line="240" w:lineRule="auto"/>
+      </w:pPr>
+      <w:r>
+        <w:rPr>
+          <w:rFonts w:ascii="Consolas" w:hAnsi="Consolas" w:eastAsia="Consolas"/>
+          <w:b w:val="0"/>
+          <w:sz w:val="22"/>
+        </w:rPr>
+        <w:t>WhatsApp oficial da Nio: {{3}}.</w:t>
+      </w:r>
+    </w:p>
+    <w:p>
+      <w:pPr>
+        <w:spacing w:after="0" w:before="0" w:line="240" w:lineRule="auto"/>
+      </w:pPr>
+      <w:r>
+        <w:rPr>
+          <w:rFonts w:ascii="Consolas" w:hAnsi="Consolas" w:eastAsia="Consolas"/>
+          <w:b w:val="0"/>
+          <w:sz w:val="22"/>
+        </w:rPr>
+      </w:r>
+      <w:r>
+        <w:t xml:space="preserve"> </w:t>
+      </w:r>
+    </w:p>
+    <w:p>
+      <w:pPr>
+        <w:spacing w:after="0" w:before="0" w:line="240" w:lineRule="auto"/>
+      </w:pPr>
+      <w:r>
+        <w:rPr>
+          <w:rFonts w:ascii="Consolas" w:hAnsi="Consolas" w:eastAsia="Consolas"/>
+          <w:b w:val="0"/>
+          <w:sz w:val="22"/>
+        </w:rPr>
+        <w:t>Toque em um dos botões abaixo se precisar</w:t>
+      </w:r>
+    </w:p>
+    <w:p>
+      <w:pPr>
+        <w:spacing w:after="0" w:before="0" w:line="240" w:lineRule="auto"/>
+      </w:pPr>
+      <w:r>
+        <w:rPr>
+          <w:rFonts w:ascii="Consolas" w:hAnsi="Consolas" w:eastAsia="Consolas"/>
+          <w:b w:val="0"/>
+          <w:sz w:val="22"/>
+        </w:rPr>
+        <w:t>de ajuda com o reagendamento ou tiver dúvidas.</w:t>
+      </w:r>
+    </w:p>
+    <w:p>
+      <w:pPr>
+        <w:spacing w:after="0" w:before="0" w:line="240" w:lineRule="auto"/>
+      </w:pPr>
+      <w:r>
+        <w:rPr>
+          <w:rFonts w:ascii="Consolas" w:hAnsi="Consolas" w:eastAsia="Consolas"/>
+          <w:b w:val="0"/>
+          <w:sz w:val="22"/>
+        </w:rPr>
+      </w:r>
+      <w:r>
+        <w:t xml:space="preserve"> </w:t>
+      </w:r>
+    </w:p>
+    <w:p>
+      <w:pPr>
+        <w:spacing w:after="0" w:before="0" w:line="240" w:lineRule="auto"/>
+      </w:pPr>
+      <w:r>
+        <w:rPr>
+          <w:rFonts w:ascii="Consolas" w:hAnsi="Consolas" w:eastAsia="Consolas"/>
+          <w:b w:val="0"/>
+          <w:sz w:val="22"/>
+        </w:rPr>
+        <w:t>Obrigado por escolher a Nio Fibra.</w:t>
+      </w:r>
+    </w:p>
+    <w:p>
+      <w:pPr>
+        <w:spacing w:after="0" w:before="0" w:line="240" w:lineRule="auto"/>
+      </w:pPr>
+      <w:r>
+        <w:rPr>
+          <w:rFonts w:ascii="Consolas" w:hAnsi="Consolas" w:eastAsia="Consolas"/>
+          <w:b w:val="0"/>
+          <w:sz w:val="22"/>
+        </w:rPr>
+        <w:t>SAC: 0800 001 1000</w:t>
+      </w:r>
+    </w:p>
+    <w:p/>
     <w:p>
       <w:pPr>
         <w:spacing w:after="120" w:before="0"/>
@@ -3842,10 +4102,49 @@
       <w:r>
         <w:rPr>
           <w:rFonts w:ascii="Calibri" w:hAnsi="Calibri" w:eastAsia="Calibri"/>
-          <w:b w:val="0"/>
-          <w:sz w:val="22"/>
-        </w:rPr>
-        <w:t>• CORRIGIR / Reagendar → coleta correção ou nova data (janela 24h)</w:t>
+          <w:b/>
+          <w:sz w:val="22"/>
+        </w:rPr>
+        <w:t>Botões — obrigatório (QUICK_REPLY):</w:t>
+      </w:r>
+    </w:p>
+    <w:p>
+      <w:pPr>
+        <w:spacing w:after="40" w:before="0"/>
+      </w:pPr>
+      <w:r>
+        <w:rPr>
+          <w:rFonts w:ascii="Calibri" w:hAnsi="Calibri" w:eastAsia="Calibri"/>
+          <w:b w:val="0"/>
+          <w:sz w:val="22"/>
+        </w:rPr>
+        <w:t xml:space="preserve">  1. Reagendar  (≤25 caracteres)</w:t>
+      </w:r>
+    </w:p>
+    <w:p>
+      <w:pPr>
+        <w:spacing w:after="40" w:before="0"/>
+      </w:pPr>
+      <w:r>
+        <w:rPr>
+          <w:rFonts w:ascii="Calibri" w:hAnsi="Calibri" w:eastAsia="Calibri"/>
+          <w:b w:val="0"/>
+          <w:sz w:val="22"/>
+        </w:rPr>
+        <w:t xml:space="preserve">  2. Falar com atendente  (≤25 caracteres)</w:t>
+      </w:r>
+    </w:p>
+    <w:p>
+      <w:pPr>
+        <w:spacing w:after="40" w:before="0"/>
+      </w:pPr>
+      <w:r>
+        <w:rPr>
+          <w:rFonts w:ascii="Calibri" w:hAnsi="Calibri" w:eastAsia="Calibri"/>
+          <w:b w:val="0"/>
+          <w:sz w:val="22"/>
+        </w:rPr>
+        <w:t xml:space="preserve">  3. Entendi  (≤25 caracteres)</w:t>
       </w:r>
     </w:p>
     <w:p>
@@ -3855,10 +4154,49 @@
       <w:r>
         <w:rPr>
           <w:rFonts w:ascii="Calibri" w:hAnsi="Calibri" w:eastAsia="Calibri"/>
-          <w:b w:val="0"/>
-          <w:sz w:val="22"/>
-        </w:rPr>
-        <w:t>• Confirmar → envia nio_instalacao_confirmada_v1</w:t>
+          <w:b/>
+          <w:sz w:val="22"/>
+        </w:rPr>
+        <w:t>Variáveis (CRM):</w:t>
+      </w:r>
+    </w:p>
+    <w:p>
+      <w:pPr>
+        <w:spacing w:after="40" w:before="0"/>
+      </w:pPr>
+      <w:r>
+        <w:rPr>
+          <w:rFonts w:ascii="Calibri" w:hAnsi="Calibri" w:eastAsia="Calibri"/>
+          <w:b w:val="0"/>
+          <w:sz w:val="22"/>
+        </w:rPr>
+        <w:t>• {{1}} saudação</w:t>
+      </w:r>
+    </w:p>
+    <w:p>
+      <w:pPr>
+        <w:spacing w:after="40" w:before="0"/>
+      </w:pPr>
+      <w:r>
+        <w:rPr>
+          <w:rFonts w:ascii="Calibri" w:hAnsi="Calibri" w:eastAsia="Calibri"/>
+          <w:b w:val="0"/>
+          <w:sz w:val="22"/>
+        </w:rPr>
+        <w:t>• {{2}} primeiro nome</w:t>
+      </w:r>
+    </w:p>
+    <w:p>
+      <w:pPr>
+        <w:spacing w:after="40" w:before="0"/>
+      </w:pPr>
+      <w:r>
+        <w:rPr>
+          <w:rFonts w:ascii="Calibri" w:hAnsi="Calibri" w:eastAsia="Calibri"/>
+          <w:b w:val="0"/>
+          <w:sz w:val="22"/>
+        </w:rPr>
+        <w:t>• {{3}} WhatsApp oficial Nio (ex.: 21 3605-1000)</w:t>
       </w:r>
     </w:p>
     <w:p>
@@ -3868,10 +4206,147 @@
       <w:r>
         <w:rPr>
           <w:rFonts w:ascii="Calibri" w:hAnsi="Calibri" w:eastAsia="Calibri"/>
-          <w:b w:val="0"/>
-          <w:sz w:val="22"/>
-        </w:rPr>
-        <w:t>• Entendi → encerra interação ok</w:t>
+          <w:b/>
+          <w:sz w:val="22"/>
+        </w:rPr>
+        <w:t>Notas:</w:t>
+      </w:r>
+    </w:p>
+    <w:p>
+      <w:pPr>
+        <w:spacing w:after="40" w:before="0"/>
+      </w:pPr>
+      <w:r>
+        <w:rPr>
+          <w:rFonts w:ascii="Calibri" w:hAnsi="Calibri" w:eastAsia="Calibri"/>
+          <w:b w:val="0"/>
+          <w:sz w:val="22"/>
+        </w:rPr>
+        <w:t>• Disparo CRM: esteira, ao registrar pendência tipo CLIENTE, somente após modal «Enviar WhatsApp ao cliente?» = Sim.</w:t>
+      </w:r>
+    </w:p>
+    <w:p>
+      <w:pPr>
+        <w:spacing w:after="40" w:before="0"/>
+      </w:pPr>
+      <w:r>
+        <w:rPr>
+          <w:rFonts w:ascii="Calibri" w:hAnsi="Calibri" w:eastAsia="Calibri"/>
+          <w:b w:val="0"/>
+          <w:sz w:val="22"/>
+        </w:rPr>
+        <w:t>• CRM: Reagendar → coleta intenção / orienta canal Nio; Falar com atendente → fila humana; Entendi → encerra ok.</w:t>
+      </w:r>
+    </w:p>
+    <w:p>
+      <w:pPr>
+        <w:spacing w:after="40" w:before="0"/>
+      </w:pPr>
+      <w:r>
+        <w:rPr>
+          <w:rFonts w:ascii="Calibri" w:hAnsi="Calibri" w:eastAsia="Calibri"/>
+          <w:b w:val="0"/>
+          <w:sz w:val="22"/>
+        </w:rPr>
+        <w:t>• Não culpar o cliente; tom UTILITY (atualização de status do pedido).</w:t>
+      </w:r>
+    </w:p>
+    <w:p/>
+    <w:p>
+      <w:pPr>
+        <w:pStyle w:val="Heading2"/>
+      </w:pPr>
+      <w:r>
+        <w:rPr>
+          <w:rFonts w:ascii="Calibri" w:hAnsi="Calibri" w:eastAsia="Calibri"/>
+          <w:b/>
+          <w:sz w:val="26"/>
+        </w:rPr>
+        <w:t>8. Boas-vindas pós-instalação</w:t>
+      </w:r>
+    </w:p>
+    <w:p>
+      <w:pPr>
+        <w:spacing w:after="40"/>
+      </w:pPr>
+      <w:r>
+        <w:rPr>
+          <w:rFonts w:ascii="Calibri" w:hAnsi="Calibri" w:eastAsia="Calibri"/>
+          <w:b/>
+          <w:sz w:val="22"/>
+        </w:rPr>
+        <w:t xml:space="preserve">Nome sugerido: </w:t>
+      </w:r>
+      <w:r>
+        <w:rPr>
+          <w:rFonts w:ascii="Calibri" w:hAnsi="Calibri" w:eastAsia="Calibri"/>
+          <w:b w:val="0"/>
+          <w:sz w:val="22"/>
+        </w:rPr>
+        <w:t>nio_boas_vindas_v1</w:t>
+      </w:r>
+    </w:p>
+    <w:p>
+      <w:pPr>
+        <w:spacing w:after="40"/>
+      </w:pPr>
+      <w:r>
+        <w:rPr>
+          <w:rFonts w:ascii="Calibri" w:hAnsi="Calibri" w:eastAsia="Calibri"/>
+          <w:b/>
+          <w:sz w:val="22"/>
+        </w:rPr>
+        <w:t xml:space="preserve">Categoria: </w:t>
+      </w:r>
+      <w:r>
+        <w:rPr>
+          <w:rFonts w:ascii="Calibri" w:hAnsi="Calibri" w:eastAsia="Calibri"/>
+          <w:b w:val="0"/>
+          <w:sz w:val="22"/>
+        </w:rPr>
+        <w:t>UTILITY</w:t>
+      </w:r>
+    </w:p>
+    <w:p>
+      <w:pPr>
+        <w:spacing w:after="40"/>
+      </w:pPr>
+      <w:r>
+        <w:rPr>
+          <w:rFonts w:ascii="Calibri" w:hAnsi="Calibri" w:eastAsia="Calibri"/>
+          <w:b/>
+          <w:sz w:val="22"/>
+        </w:rPr>
+        <w:t xml:space="preserve">Idioma: </w:t>
+      </w:r>
+      <w:r>
+        <w:rPr>
+          <w:rFonts w:ascii="Calibri" w:hAnsi="Calibri" w:eastAsia="Calibri"/>
+          <w:b w:val="0"/>
+          <w:sz w:val="22"/>
+        </w:rPr>
+        <w:t>pt_BR</w:t>
+      </w:r>
+    </w:p>
+    <w:p>
+      <w:pPr>
+        <w:spacing w:after="40"/>
+      </w:pPr>
+      <w:r>
+        <w:rPr>
+          <w:rFonts w:ascii="Calibri" w:hAnsi="Calibri" w:eastAsia="Calibri"/>
+          <w:b/>
+          <w:sz w:val="22"/>
+        </w:rPr>
+        <w:t xml:space="preserve">Finalidade: </w:t>
+      </w:r>
+      <w:r>
+        <w:rPr>
+          <w:rFonts w:ascii="Calibri" w:hAnsi="Calibri" w:eastAsia="Calibri"/>
+          <w:b w:val="0"/>
+          <w:sz w:val="22"/>
+        </w:rPr>
+        <w:t>Boas-vindas ao concluir instalação (Esteira / status INSTALADA)</w:t>
       </w:r>
     </w:p>
     <w:p>
@@ -3881,12 +4356,218 @@
       <w:r>
         <w:rPr>
           <w:rFonts w:ascii="Calibri" w:hAnsi="Calibri" w:eastAsia="Calibri"/>
-          <w:b w:val="0"/>
-          <w:sz w:val="22"/>
-        </w:rPr>
-        <w:t>• Quero a 2ª via → envia fatura (PIX/barras/PDF)</w:t>
-      </w:r>
-    </w:p>
+          <w:b/>
+          <w:sz w:val="22"/>
+        </w:rPr>
+        <w:t>Corpo (colar no Manager — cada linha = Enter):</w:t>
+      </w:r>
+    </w:p>
+    <w:p>
+      <w:pPr>
+        <w:spacing w:after="0" w:before="0" w:line="240" w:lineRule="auto"/>
+      </w:pPr>
+      <w:r>
+        <w:rPr>
+          <w:rFonts w:ascii="Consolas" w:hAnsi="Consolas" w:eastAsia="Consolas"/>
+          <w:b w:val="0"/>
+          <w:sz w:val="22"/>
+        </w:rPr>
+        <w:t>Olá, {{1}}!</w:t>
+      </w:r>
+    </w:p>
+    <w:p>
+      <w:pPr>
+        <w:spacing w:after="0" w:before="0" w:line="240" w:lineRule="auto"/>
+      </w:pPr>
+      <w:r>
+        <w:rPr>
+          <w:rFonts w:ascii="Consolas" w:hAnsi="Consolas" w:eastAsia="Consolas"/>
+          <w:b w:val="0"/>
+          <w:sz w:val="22"/>
+        </w:rPr>
+      </w:r>
+      <w:r>
+        <w:t xml:space="preserve"> </w:t>
+      </w:r>
+    </w:p>
+    <w:p>
+      <w:pPr>
+        <w:spacing w:after="0" w:before="0" w:line="240" w:lineRule="auto"/>
+      </w:pPr>
+      <w:r>
+        <w:rPr>
+          <w:rFonts w:ascii="Consolas" w:hAnsi="Consolas" w:eastAsia="Consolas"/>
+          <w:b w:val="0"/>
+          <w:sz w:val="22"/>
+        </w:rPr>
+        <w:t>{{2}},</w:t>
+      </w:r>
+    </w:p>
+    <w:p>
+      <w:pPr>
+        <w:spacing w:after="0" w:before="0" w:line="240" w:lineRule="auto"/>
+      </w:pPr>
+      <w:r>
+        <w:rPr>
+          <w:rFonts w:ascii="Consolas" w:hAnsi="Consolas" w:eastAsia="Consolas"/>
+          <w:b w:val="0"/>
+          <w:sz w:val="22"/>
+        </w:rPr>
+      </w:r>
+      <w:r>
+        <w:t xml:space="preserve"> </w:t>
+      </w:r>
+    </w:p>
+    <w:p>
+      <w:pPr>
+        <w:spacing w:after="0" w:before="0" w:line="240" w:lineRule="auto"/>
+      </w:pPr>
+      <w:r>
+        <w:rPr>
+          <w:rFonts w:ascii="Consolas" w:hAnsi="Consolas" w:eastAsia="Consolas"/>
+          <w:b w:val="0"/>
+          <w:sz w:val="22"/>
+        </w:rPr>
+        <w:t>Parceiro oficial da Nio Fibra.</w:t>
+      </w:r>
+    </w:p>
+    <w:p>
+      <w:pPr>
+        <w:spacing w:after="0" w:before="0" w:line="240" w:lineRule="auto"/>
+      </w:pPr>
+      <w:r>
+        <w:rPr>
+          <w:rFonts w:ascii="Consolas" w:hAnsi="Consolas" w:eastAsia="Consolas"/>
+          <w:b w:val="0"/>
+          <w:sz w:val="22"/>
+        </w:rPr>
+        <w:t>Sua instalação Nio Fibra foi concluída.</w:t>
+      </w:r>
+    </w:p>
+    <w:p>
+      <w:pPr>
+        <w:spacing w:after="0" w:before="0" w:line="240" w:lineRule="auto"/>
+      </w:pPr>
+      <w:r>
+        <w:rPr>
+          <w:rFonts w:ascii="Consolas" w:hAnsi="Consolas" w:eastAsia="Consolas"/>
+          <w:b w:val="0"/>
+          <w:sz w:val="22"/>
+        </w:rPr>
+        <w:t>Seja bem-vindo(a)!</w:t>
+      </w:r>
+    </w:p>
+    <w:p>
+      <w:pPr>
+        <w:spacing w:after="0" w:before="0" w:line="240" w:lineRule="auto"/>
+      </w:pPr>
+      <w:r>
+        <w:rPr>
+          <w:rFonts w:ascii="Consolas" w:hAnsi="Consolas" w:eastAsia="Consolas"/>
+          <w:b w:val="0"/>
+          <w:sz w:val="22"/>
+        </w:rPr>
+      </w:r>
+      <w:r>
+        <w:t xml:space="preserve"> </w:t>
+      </w:r>
+    </w:p>
+    <w:p>
+      <w:pPr>
+        <w:spacing w:after="0" w:before="0" w:line="240" w:lineRule="auto"/>
+      </w:pPr>
+      <w:r>
+        <w:rPr>
+          <w:rFonts w:ascii="Consolas" w:hAnsi="Consolas" w:eastAsia="Consolas"/>
+          <w:b w:val="0"/>
+          <w:sz w:val="22"/>
+        </w:rPr>
+        <w:t>Guarde este WhatsApp para suporte e</w:t>
+      </w:r>
+    </w:p>
+    <w:p>
+      <w:pPr>
+        <w:spacing w:after="0" w:before="0" w:line="240" w:lineRule="auto"/>
+      </w:pPr>
+      <w:r>
+        <w:rPr>
+          <w:rFonts w:ascii="Consolas" w:hAnsi="Consolas" w:eastAsia="Consolas"/>
+          <w:b w:val="0"/>
+          <w:sz w:val="22"/>
+        </w:rPr>
+        <w:t>dúvidas sobre sua conexão.</w:t>
+      </w:r>
+    </w:p>
+    <w:p>
+      <w:pPr>
+        <w:spacing w:after="0" w:before="0" w:line="240" w:lineRule="auto"/>
+      </w:pPr>
+      <w:r>
+        <w:rPr>
+          <w:rFonts w:ascii="Consolas" w:hAnsi="Consolas" w:eastAsia="Consolas"/>
+          <w:b w:val="0"/>
+          <w:sz w:val="22"/>
+        </w:rPr>
+      </w:r>
+      <w:r>
+        <w:t xml:space="preserve"> </w:t>
+      </w:r>
+    </w:p>
+    <w:p>
+      <w:pPr>
+        <w:spacing w:after="0" w:before="0" w:line="240" w:lineRule="auto"/>
+      </w:pPr>
+      <w:r>
+        <w:rPr>
+          <w:rFonts w:ascii="Consolas" w:hAnsi="Consolas" w:eastAsia="Consolas"/>
+          <w:b w:val="0"/>
+          <w:sz w:val="22"/>
+        </w:rPr>
+        <w:t>SAC: 0800 001 1000 | WhatsApp: 21 3605-1000</w:t>
+      </w:r>
+    </w:p>
+    <w:p>
+      <w:pPr>
+        <w:spacing w:after="0" w:before="0" w:line="240" w:lineRule="auto"/>
+      </w:pPr>
+      <w:r>
+        <w:rPr>
+          <w:rFonts w:ascii="Consolas" w:hAnsi="Consolas" w:eastAsia="Consolas"/>
+          <w:b w:val="0"/>
+          <w:sz w:val="22"/>
+        </w:rPr>
+      </w:r>
+      <w:r>
+        <w:t xml:space="preserve"> </w:t>
+      </w:r>
+    </w:p>
+    <w:p>
+      <w:pPr>
+        <w:spacing w:after="0" w:before="0" w:line="240" w:lineRule="auto"/>
+      </w:pPr>
+      <w:r>
+        <w:rPr>
+          <w:rFonts w:ascii="Consolas" w:hAnsi="Consolas" w:eastAsia="Consolas"/>
+          <w:b w:val="0"/>
+          <w:sz w:val="22"/>
+        </w:rPr>
+        <w:t>Toque em um dos botões abaixo se precisar</w:t>
+      </w:r>
+    </w:p>
+    <w:p>
+      <w:pPr>
+        <w:spacing w:after="0" w:before="0" w:line="240" w:lineRule="auto"/>
+      </w:pPr>
+      <w:r>
+        <w:rPr>
+          <w:rFonts w:ascii="Consolas" w:hAnsi="Consolas" w:eastAsia="Consolas"/>
+          <w:b w:val="0"/>
+          <w:sz w:val="22"/>
+        </w:rPr>
+        <w:t>de ajuda agora.</w:t>
+      </w:r>
+    </w:p>
+    <w:p/>
     <w:p>
       <w:pPr>
         <w:spacing w:after="120" w:before="0"/>
@@ -3894,10 +4575,49 @@
       <w:r>
         <w:rPr>
           <w:rFonts w:ascii="Calibri" w:hAnsi="Calibri" w:eastAsia="Calibri"/>
-          <w:b w:val="0"/>
-          <w:sz w:val="22"/>
-        </w:rPr>
-        <w:t>• Já paguei → solicita comprovante / fila de baixa</w:t>
+          <w:b/>
+          <w:sz w:val="22"/>
+        </w:rPr>
+        <w:t>Botões — obrigatório (QUICK_REPLY):</w:t>
+      </w:r>
+    </w:p>
+    <w:p>
+      <w:pPr>
+        <w:spacing w:after="40" w:before="0"/>
+      </w:pPr>
+      <w:r>
+        <w:rPr>
+          <w:rFonts w:ascii="Calibri" w:hAnsi="Calibri" w:eastAsia="Calibri"/>
+          <w:b w:val="0"/>
+          <w:sz w:val="22"/>
+        </w:rPr>
+        <w:t xml:space="preserve">  1. Entendi  (≤25 caracteres)</w:t>
+      </w:r>
+    </w:p>
+    <w:p>
+      <w:pPr>
+        <w:spacing w:after="40" w:before="0"/>
+      </w:pPr>
+      <w:r>
+        <w:rPr>
+          <w:rFonts w:ascii="Calibri" w:hAnsi="Calibri" w:eastAsia="Calibri"/>
+          <w:b w:val="0"/>
+          <w:sz w:val="22"/>
+        </w:rPr>
+        <w:t xml:space="preserve">  2. Falar com atendente  (≤25 caracteres)</w:t>
+      </w:r>
+    </w:p>
+    <w:p>
+      <w:pPr>
+        <w:spacing w:after="40" w:before="0"/>
+      </w:pPr>
+      <w:r>
+        <w:rPr>
+          <w:rFonts w:ascii="Calibri" w:hAnsi="Calibri" w:eastAsia="Calibri"/>
+          <w:b w:val="0"/>
+          <w:sz w:val="22"/>
+        </w:rPr>
+        <w:t xml:space="preserve">  3. Suporte  (≤25 caracteres)</w:t>
       </w:r>
     </w:p>
     <w:p>
@@ -3907,12 +4627,78 @@
       <w:r>
         <w:rPr>
           <w:rFonts w:ascii="Calibri" w:hAnsi="Calibri" w:eastAsia="Calibri"/>
-          <w:b w:val="0"/>
-          <w:sz w:val="22"/>
-        </w:rPr>
-        <w:t>• Suporte / Falar com suporte / Falar com atendente → fila humana</w:t>
-      </w:r>
-    </w:p>
+          <w:b/>
+          <w:sz w:val="22"/>
+        </w:rPr>
+        <w:t>Variáveis (CRM):</w:t>
+      </w:r>
+    </w:p>
+    <w:p>
+      <w:pPr>
+        <w:spacing w:after="40" w:before="0"/>
+      </w:pPr>
+      <w:r>
+        <w:rPr>
+          <w:rFonts w:ascii="Calibri" w:hAnsi="Calibri" w:eastAsia="Calibri"/>
+          <w:b w:val="0"/>
+          <w:sz w:val="22"/>
+        </w:rPr>
+        <w:t>• {{1}} saudação</w:t>
+      </w:r>
+    </w:p>
+    <w:p>
+      <w:pPr>
+        <w:spacing w:after="40" w:before="0"/>
+      </w:pPr>
+      <w:r>
+        <w:rPr>
+          <w:rFonts w:ascii="Calibri" w:hAnsi="Calibri" w:eastAsia="Calibri"/>
+          <w:b w:val="0"/>
+          <w:sz w:val="22"/>
+        </w:rPr>
+        <w:t>• {{2}} primeiro nome</w:t>
+      </w:r>
+    </w:p>
+    <w:p>
+      <w:pPr>
+        <w:spacing w:after="120" w:before="0"/>
+      </w:pPr>
+      <w:r>
+        <w:rPr>
+          <w:rFonts w:ascii="Calibri" w:hAnsi="Calibri" w:eastAsia="Calibri"/>
+          <w:b/>
+          <w:sz w:val="22"/>
+        </w:rPr>
+        <w:t>Notas:</w:t>
+      </w:r>
+    </w:p>
+    <w:p>
+      <w:pPr>
+        <w:spacing w:after="40" w:before="0"/>
+      </w:pPr>
+      <w:r>
+        <w:rPr>
+          <w:rFonts w:ascii="Calibri" w:hAnsi="Calibri" w:eastAsia="Calibri"/>
+          <w:b w:val="0"/>
+          <w:sz w:val="22"/>
+        </w:rPr>
+        <w:t>• Disparo CRM: ao virar INSTALADA (automático), com opção de não enviar.</w:t>
+      </w:r>
+    </w:p>
+    <w:p>
+      <w:pPr>
+        <w:spacing w:after="40" w:before="0"/>
+      </w:pPr>
+      <w:r>
+        <w:rPr>
+          <w:rFonts w:ascii="Calibri" w:hAnsi="Calibri" w:eastAsia="Calibri"/>
+          <w:b w:val="0"/>
+          <w:sz w:val="22"/>
+        </w:rPr>
+        <w:t>• CRM: Entendi → ok; Falar com atendente / Suporte → fila humana.</w:t>
+      </w:r>
+    </w:p>
+    <w:p/>
     <w:p>
       <w:pPr>
         <w:pStyle w:val="Heading1"/>
@@ -3923,6 +4709,110 @@
           <w:b/>
           <w:sz w:val="32"/>
         </w:rPr>
+        <w:t>Mapa rápido — texto do botão → ação CRM</w:t>
+      </w:r>
+    </w:p>
+    <w:p>
+      <w:pPr>
+        <w:spacing w:after="120" w:before="0"/>
+      </w:pPr>
+      <w:r>
+        <w:rPr>
+          <w:rFonts w:ascii="Calibri" w:hAnsi="Calibri" w:eastAsia="Calibri"/>
+          <w:b w:val="0"/>
+          <w:sz w:val="22"/>
+        </w:rPr>
+        <w:t>• CORRETO → avança pedido</w:t>
+      </w:r>
+    </w:p>
+    <w:p>
+      <w:pPr>
+        <w:spacing w:after="120" w:before="0"/>
+      </w:pPr>
+      <w:r>
+        <w:rPr>
+          <w:rFonts w:ascii="Calibri" w:hAnsi="Calibri" w:eastAsia="Calibri"/>
+          <w:b w:val="0"/>
+          <w:sz w:val="22"/>
+        </w:rPr>
+        <w:t>• CORRIGIR / Reagendar → coleta correção ou nova data (janela 24h)</w:t>
+      </w:r>
+    </w:p>
+    <w:p>
+      <w:pPr>
+        <w:spacing w:after="120" w:before="0"/>
+      </w:pPr>
+      <w:r>
+        <w:rPr>
+          <w:rFonts w:ascii="Calibri" w:hAnsi="Calibri" w:eastAsia="Calibri"/>
+          <w:b w:val="0"/>
+          <w:sz w:val="22"/>
+        </w:rPr>
+        <w:t>• Confirmar → envia nio_instalacao_confirmada_v1_2</w:t>
+      </w:r>
+    </w:p>
+    <w:p>
+      <w:pPr>
+        <w:spacing w:after="120" w:before="0"/>
+      </w:pPr>
+      <w:r>
+        <w:rPr>
+          <w:rFonts w:ascii="Calibri" w:hAnsi="Calibri" w:eastAsia="Calibri"/>
+          <w:b w:val="0"/>
+          <w:sz w:val="22"/>
+        </w:rPr>
+        <w:t>• Entendi → encerra interação ok</w:t>
+      </w:r>
+    </w:p>
+    <w:p>
+      <w:pPr>
+        <w:spacing w:after="120" w:before="0"/>
+      </w:pPr>
+      <w:r>
+        <w:rPr>
+          <w:rFonts w:ascii="Calibri" w:hAnsi="Calibri" w:eastAsia="Calibri"/>
+          <w:b w:val="0"/>
+          <w:sz w:val="22"/>
+        </w:rPr>
+        <w:t>• Quero a 2ª via → envia fatura (PIX/barras/PDF)</w:t>
+      </w:r>
+    </w:p>
+    <w:p>
+      <w:pPr>
+        <w:spacing w:after="120" w:before="0"/>
+      </w:pPr>
+      <w:r>
+        <w:rPr>
+          <w:rFonts w:ascii="Calibri" w:hAnsi="Calibri" w:eastAsia="Calibri"/>
+          <w:b w:val="0"/>
+          <w:sz w:val="22"/>
+        </w:rPr>
+        <w:t>• Já paguei → solicita comprovante / fila de baixa</w:t>
+      </w:r>
+    </w:p>
+    <w:p>
+      <w:pPr>
+        <w:spacing w:after="120" w:before="0"/>
+      </w:pPr>
+      <w:r>
+        <w:rPr>
+          <w:rFonts w:ascii="Calibri" w:hAnsi="Calibri" w:eastAsia="Calibri"/>
+          <w:b w:val="0"/>
+          <w:sz w:val="22"/>
+        </w:rPr>
+        <w:t>• Suporte / Falar com suporte / Falar com atendente → fila humana</w:t>
+      </w:r>
+    </w:p>
+    <w:p>
+      <w:pPr>
+        <w:pStyle w:val="Heading1"/>
+      </w:pPr>
+      <w:r>
+        <w:rPr>
+          <w:rFonts w:ascii="Calibri" w:hAnsi="Calibri" w:eastAsia="Calibri"/>
+          <w:b/>
+          <w:sz w:val="32"/>
+        </w:rPr>
         <w:t>Checklist de submissão</w:t>
       </w:r>
     </w:p>
@@ -3949,7 +4839,46 @@
           <w:b w:val="0"/>
           <w:sz w:val="22"/>
         </w:rPr>
-        <w:t>☐ Buttons = Quick reply (3 botões) em todos os 6 templates</w:t>
+        <w:t>☐ Buttons = Quick reply (3 botões) em todos os templates</w:t>
+      </w:r>
+    </w:p>
+    <w:p>
+      <w:pPr>
+        <w:spacing w:after="120" w:before="0"/>
+      </w:pPr>
+      <w:r>
+        <w:rPr>
+          <w:rFonts w:ascii="Calibri" w:hAnsi="Calibri" w:eastAsia="Calibri"/>
+          <w:b w:val="0"/>
+          <w:sz w:val="22"/>
+        </w:rPr>
+        <w:t>☐ Incluir templates 7 (pendência) e 8 (boas-vindas) junto dos 6 já aprovados</w:t>
+      </w:r>
+    </w:p>
+    <w:p>
+      <w:pPr>
+        <w:spacing w:after="120" w:before="0"/>
+      </w:pPr>
+      <w:r>
+        <w:rPr>
+          <w:rFonts w:ascii="Calibri" w:hAnsi="Calibri" w:eastAsia="Calibri"/>
+          <w:b w:val="0"/>
+          <w:sz w:val="22"/>
+        </w:rPr>
+        <w:t>☐ Idioma pt_BR · sem marketing/oferta</w:t>
+      </w:r>
+    </w:p>
+    <w:p>
+      <w:pPr>
+        <w:spacing w:after="120" w:before="0"/>
+      </w:pPr>
+      <w:r>
+        <w:rPr>
+          <w:rFonts w:ascii="Calibri" w:hAnsi="Calibri" w:eastAsia="Calibri"/>
+          <w:b w:val="0"/>
+          <w:sz w:val="22"/>
+        </w:rPr>
+        <w:t>☐ Após aprovação na WABA (#194), validar envio no CRM (esteira + scheduler)</w:t>
       </w:r>
     </w:p>
     <w:p>

</xml_diff>

<commit_message>
fix(auditoria): resolver alert de JS e adicionar opcao de periodo na busca PAP
</commit_message>
<xml_diff>
--- a/docs/WhatsApp_Templates_Aprovacao_Meta.docx
+++ b/docs/WhatsApp_Templates_Aprovacao_Meta.docx
@@ -4701,6 +4701,585 @@
     <w:p/>
     <w:p>
       <w:pPr>
+        <w:pStyle w:val="Heading2"/>
+      </w:pPr>
+      <w:r>
+        <w:rPr>
+          <w:rFonts w:ascii="Calibri" w:hAnsi="Calibri" w:eastAsia="Calibri"/>
+          <w:b/>
+          <w:sz w:val="26"/>
+        </w:rPr>
+        <w:t>9. Redução de sinal — fatura em aberto</w:t>
+      </w:r>
+    </w:p>
+    <w:p>
+      <w:pPr>
+        <w:spacing w:after="40"/>
+      </w:pPr>
+      <w:r>
+        <w:rPr>
+          <w:rFonts w:ascii="Calibri" w:hAnsi="Calibri" w:eastAsia="Calibri"/>
+          <w:b/>
+          <w:sz w:val="22"/>
+        </w:rPr>
+        <w:t xml:space="preserve">Nome sugerido: </w:t>
+      </w:r>
+      <w:r>
+        <w:rPr>
+          <w:rFonts w:ascii="Calibri" w:hAnsi="Calibri" w:eastAsia="Calibri"/>
+          <w:b w:val="0"/>
+          <w:sz w:val="22"/>
+        </w:rPr>
+        <w:t>nio_fatura_reducao_sinal_v1</w:t>
+      </w:r>
+    </w:p>
+    <w:p>
+      <w:pPr>
+        <w:spacing w:after="40"/>
+      </w:pPr>
+      <w:r>
+        <w:rPr>
+          <w:rFonts w:ascii="Calibri" w:hAnsi="Calibri" w:eastAsia="Calibri"/>
+          <w:b/>
+          <w:sz w:val="22"/>
+        </w:rPr>
+        <w:t xml:space="preserve">Categoria: </w:t>
+      </w:r>
+      <w:r>
+        <w:rPr>
+          <w:rFonts w:ascii="Calibri" w:hAnsi="Calibri" w:eastAsia="Calibri"/>
+          <w:b w:val="0"/>
+          <w:sz w:val="22"/>
+        </w:rPr>
+        <w:t>UTILITY</w:t>
+      </w:r>
+    </w:p>
+    <w:p>
+      <w:pPr>
+        <w:spacing w:after="40"/>
+      </w:pPr>
+      <w:r>
+        <w:rPr>
+          <w:rFonts w:ascii="Calibri" w:hAnsi="Calibri" w:eastAsia="Calibri"/>
+          <w:b/>
+          <w:sz w:val="22"/>
+        </w:rPr>
+        <w:t xml:space="preserve">Idioma: </w:t>
+      </w:r>
+      <w:r>
+        <w:rPr>
+          <w:rFonts w:ascii="Calibri" w:hAnsi="Calibri" w:eastAsia="Calibri"/>
+          <w:b w:val="0"/>
+          <w:sz w:val="22"/>
+        </w:rPr>
+        <w:t>pt_BR</w:t>
+      </w:r>
+    </w:p>
+    <w:p>
+      <w:pPr>
+        <w:spacing w:after="40"/>
+      </w:pPr>
+      <w:r>
+        <w:rPr>
+          <w:rFonts w:ascii="Calibri" w:hAnsi="Calibri" w:eastAsia="Calibri"/>
+          <w:b/>
+          <w:sz w:val="22"/>
+        </w:rPr>
+        <w:t xml:space="preserve">Finalidade: </w:t>
+      </w:r>
+      <w:r>
+        <w:rPr>
+          <w:rFonts w:ascii="Calibri" w:hAnsi="Calibri" w:eastAsia="Calibri"/>
+          <w:b w:val="0"/>
+          <w:sz w:val="22"/>
+        </w:rPr>
+        <w:t>Avisar velocidade reduzida por pendência e pedir previsão de pagamento</w:t>
+      </w:r>
+    </w:p>
+    <w:p>
+      <w:pPr>
+        <w:spacing w:after="120" w:before="0"/>
+      </w:pPr>
+      <w:r>
+        <w:rPr>
+          <w:rFonts w:ascii="Calibri" w:hAnsi="Calibri" w:eastAsia="Calibri"/>
+          <w:b/>
+          <w:sz w:val="22"/>
+        </w:rPr>
+        <w:t>Corpo (colar no Manager — cada linha = Enter):</w:t>
+      </w:r>
+    </w:p>
+    <w:p>
+      <w:pPr>
+        <w:spacing w:after="0" w:before="0" w:line="240" w:lineRule="auto"/>
+      </w:pPr>
+      <w:r>
+        <w:rPr>
+          <w:rFonts w:ascii="Consolas" w:hAnsi="Consolas" w:eastAsia="Consolas"/>
+          <w:b w:val="0"/>
+          <w:sz w:val="22"/>
+        </w:rPr>
+        <w:t>Olá, {{1}}!</w:t>
+      </w:r>
+    </w:p>
+    <w:p>
+      <w:pPr>
+        <w:spacing w:after="0" w:before="0" w:line="240" w:lineRule="auto"/>
+      </w:pPr>
+      <w:r>
+        <w:rPr>
+          <w:rFonts w:ascii="Consolas" w:hAnsi="Consolas" w:eastAsia="Consolas"/>
+          <w:b w:val="0"/>
+          <w:sz w:val="22"/>
+        </w:rPr>
+      </w:r>
+      <w:r>
+        <w:t xml:space="preserve"> </w:t>
+      </w:r>
+    </w:p>
+    <w:p>
+      <w:pPr>
+        <w:spacing w:after="0" w:before="0" w:line="240" w:lineRule="auto"/>
+      </w:pPr>
+      <w:r>
+        <w:rPr>
+          <w:rFonts w:ascii="Consolas" w:hAnsi="Consolas" w:eastAsia="Consolas"/>
+          <w:b w:val="0"/>
+          <w:sz w:val="22"/>
+        </w:rPr>
+        <w:t>{{2}},</w:t>
+      </w:r>
+    </w:p>
+    <w:p>
+      <w:pPr>
+        <w:spacing w:after="0" w:before="0" w:line="240" w:lineRule="auto"/>
+      </w:pPr>
+      <w:r>
+        <w:rPr>
+          <w:rFonts w:ascii="Consolas" w:hAnsi="Consolas" w:eastAsia="Consolas"/>
+          <w:b w:val="0"/>
+          <w:sz w:val="22"/>
+        </w:rPr>
+      </w:r>
+      <w:r>
+        <w:t xml:space="preserve"> </w:t>
+      </w:r>
+    </w:p>
+    <w:p>
+      <w:pPr>
+        <w:spacing w:after="0" w:before="0" w:line="240" w:lineRule="auto"/>
+      </w:pPr>
+      <w:r>
+        <w:rPr>
+          <w:rFonts w:ascii="Consolas" w:hAnsi="Consolas" w:eastAsia="Consolas"/>
+          <w:b w:val="0"/>
+          <w:sz w:val="22"/>
+        </w:rPr>
+        <w:t>Parceiro oficial da Nio Fibra.</w:t>
+      </w:r>
+    </w:p>
+    <w:p>
+      <w:pPr>
+        <w:spacing w:after="0" w:before="0" w:line="240" w:lineRule="auto"/>
+      </w:pPr>
+      <w:r>
+        <w:rPr>
+          <w:rFonts w:ascii="Consolas" w:hAnsi="Consolas" w:eastAsia="Consolas"/>
+          <w:b w:val="0"/>
+          <w:sz w:val="22"/>
+        </w:rPr>
+        <w:t>Sua internet está com a velocidade reduzida</w:t>
+      </w:r>
+    </w:p>
+    <w:p>
+      <w:pPr>
+        <w:spacing w:after="0" w:before="0" w:line="240" w:lineRule="auto"/>
+      </w:pPr>
+      <w:r>
+        <w:rPr>
+          <w:rFonts w:ascii="Consolas" w:hAnsi="Consolas" w:eastAsia="Consolas"/>
+          <w:b w:val="0"/>
+          <w:sz w:val="22"/>
+        </w:rPr>
+        <w:t>devido a uma pendência de pagamento.</w:t>
+      </w:r>
+    </w:p>
+    <w:p>
+      <w:pPr>
+        <w:spacing w:after="0" w:before="0" w:line="240" w:lineRule="auto"/>
+      </w:pPr>
+      <w:r>
+        <w:rPr>
+          <w:rFonts w:ascii="Consolas" w:hAnsi="Consolas" w:eastAsia="Consolas"/>
+          <w:b w:val="0"/>
+          <w:sz w:val="22"/>
+        </w:rPr>
+      </w:r>
+      <w:r>
+        <w:t xml:space="preserve"> </w:t>
+      </w:r>
+    </w:p>
+    <w:p>
+      <w:pPr>
+        <w:spacing w:after="0" w:before="0" w:line="240" w:lineRule="auto"/>
+      </w:pPr>
+      <w:r>
+        <w:rPr>
+          <w:rFonts w:ascii="Consolas" w:hAnsi="Consolas" w:eastAsia="Consolas"/>
+          <w:b w:val="0"/>
+          <w:sz w:val="22"/>
+        </w:rPr>
+        <w:t>Referência: *{{3}}*</w:t>
+      </w:r>
+    </w:p>
+    <w:p>
+      <w:pPr>
+        <w:spacing w:after="0" w:before="0" w:line="240" w:lineRule="auto"/>
+      </w:pPr>
+      <w:r>
+        <w:rPr>
+          <w:rFonts w:ascii="Consolas" w:hAnsi="Consolas" w:eastAsia="Consolas"/>
+          <w:b w:val="0"/>
+          <w:sz w:val="22"/>
+        </w:rPr>
+        <w:t>Valor: *{{4}}*</w:t>
+      </w:r>
+    </w:p>
+    <w:p>
+      <w:pPr>
+        <w:spacing w:after="0" w:before="0" w:line="240" w:lineRule="auto"/>
+      </w:pPr>
+      <w:r>
+        <w:rPr>
+          <w:rFonts w:ascii="Consolas" w:hAnsi="Consolas" w:eastAsia="Consolas"/>
+          <w:b w:val="0"/>
+          <w:sz w:val="22"/>
+        </w:rPr>
+        <w:t>Vencimento: *{{5}}*</w:t>
+      </w:r>
+    </w:p>
+    <w:p>
+      <w:pPr>
+        <w:spacing w:after="0" w:before="0" w:line="240" w:lineRule="auto"/>
+      </w:pPr>
+      <w:r>
+        <w:rPr>
+          <w:rFonts w:ascii="Consolas" w:hAnsi="Consolas" w:eastAsia="Consolas"/>
+          <w:b w:val="0"/>
+          <w:sz w:val="22"/>
+        </w:rPr>
+      </w:r>
+      <w:r>
+        <w:t xml:space="preserve"> </w:t>
+      </w:r>
+    </w:p>
+    <w:p>
+      <w:pPr>
+        <w:spacing w:after="0" w:before="0" w:line="240" w:lineRule="auto"/>
+      </w:pPr>
+      <w:r>
+        <w:rPr>
+          <w:rFonts w:ascii="Consolas" w:hAnsi="Consolas" w:eastAsia="Consolas"/>
+          <w:b w:val="0"/>
+          <w:sz w:val="22"/>
+        </w:rPr>
+        <w:t>Precisamos do seu retorno para programar a</w:t>
+      </w:r>
+    </w:p>
+    <w:p>
+      <w:pPr>
+        <w:spacing w:after="0" w:before="0" w:line="240" w:lineRule="auto"/>
+      </w:pPr>
+      <w:r>
+        <w:rPr>
+          <w:rFonts w:ascii="Consolas" w:hAnsi="Consolas" w:eastAsia="Consolas"/>
+          <w:b w:val="0"/>
+          <w:sz w:val="22"/>
+        </w:rPr>
+        <w:t>regularização e liberar novamente 100% do</w:t>
+      </w:r>
+    </w:p>
+    <w:p>
+      <w:pPr>
+        <w:spacing w:after="0" w:before="0" w:line="240" w:lineRule="auto"/>
+      </w:pPr>
+      <w:r>
+        <w:rPr>
+          <w:rFonts w:ascii="Consolas" w:hAnsi="Consolas" w:eastAsia="Consolas"/>
+          <w:b w:val="0"/>
+          <w:sz w:val="22"/>
+        </w:rPr>
+        <w:t>seu sinal de fibra óptica.</w:t>
+      </w:r>
+    </w:p>
+    <w:p>
+      <w:pPr>
+        <w:spacing w:after="0" w:before="0" w:line="240" w:lineRule="auto"/>
+      </w:pPr>
+      <w:r>
+        <w:rPr>
+          <w:rFonts w:ascii="Consolas" w:hAnsi="Consolas" w:eastAsia="Consolas"/>
+          <w:b w:val="0"/>
+          <w:sz w:val="22"/>
+        </w:rPr>
+      </w:r>
+      <w:r>
+        <w:t xml:space="preserve"> </w:t>
+      </w:r>
+    </w:p>
+    <w:p>
+      <w:pPr>
+        <w:spacing w:after="0" w:before="0" w:line="240" w:lineRule="auto"/>
+      </w:pPr>
+      <w:r>
+        <w:rPr>
+          <w:rFonts w:ascii="Consolas" w:hAnsi="Consolas" w:eastAsia="Consolas"/>
+          <w:b w:val="0"/>
+          <w:sz w:val="22"/>
+        </w:rPr>
+        <w:t>Informe sua previsão de pagamento pelos</w:t>
+      </w:r>
+    </w:p>
+    <w:p>
+      <w:pPr>
+        <w:spacing w:after="0" w:before="0" w:line="240" w:lineRule="auto"/>
+      </w:pPr>
+      <w:r>
+        <w:rPr>
+          <w:rFonts w:ascii="Consolas" w:hAnsi="Consolas" w:eastAsia="Consolas"/>
+          <w:b w:val="0"/>
+          <w:sz w:val="22"/>
+        </w:rPr>
+        <w:t>botões abaixo.</w:t>
+      </w:r>
+    </w:p>
+    <w:p>
+      <w:pPr>
+        <w:spacing w:after="0" w:before="0" w:line="240" w:lineRule="auto"/>
+      </w:pPr>
+      <w:r>
+        <w:rPr>
+          <w:rFonts w:ascii="Consolas" w:hAnsi="Consolas" w:eastAsia="Consolas"/>
+          <w:b w:val="0"/>
+          <w:sz w:val="22"/>
+        </w:rPr>
+      </w:r>
+      <w:r>
+        <w:t xml:space="preserve"> </w:t>
+      </w:r>
+    </w:p>
+    <w:p>
+      <w:pPr>
+        <w:spacing w:after="0" w:before="0" w:line="240" w:lineRule="auto"/>
+      </w:pPr>
+      <w:r>
+        <w:rPr>
+          <w:rFonts w:ascii="Consolas" w:hAnsi="Consolas" w:eastAsia="Consolas"/>
+          <w:b w:val="0"/>
+          <w:sz w:val="22"/>
+        </w:rPr>
+        <w:t>SAC: 0800 001 1000 | WhatsApp: 21 3605-1000</w:t>
+      </w:r>
+    </w:p>
+    <w:p/>
+    <w:p>
+      <w:pPr>
+        <w:spacing w:after="120" w:before="0"/>
+      </w:pPr>
+      <w:r>
+        <w:rPr>
+          <w:rFonts w:ascii="Calibri" w:hAnsi="Calibri" w:eastAsia="Calibri"/>
+          <w:b/>
+          <w:sz w:val="22"/>
+        </w:rPr>
+        <w:t>Botões — obrigatório (QUICK_REPLY):</w:t>
+      </w:r>
+    </w:p>
+    <w:p>
+      <w:pPr>
+        <w:spacing w:after="40" w:before="0"/>
+      </w:pPr>
+      <w:r>
+        <w:rPr>
+          <w:rFonts w:ascii="Calibri" w:hAnsi="Calibri" w:eastAsia="Calibri"/>
+          <w:b w:val="0"/>
+          <w:sz w:val="22"/>
+        </w:rPr>
+        <w:t xml:space="preserve">  1. Informar previsão  (≤25 caracteres)</w:t>
+      </w:r>
+    </w:p>
+    <w:p>
+      <w:pPr>
+        <w:spacing w:after="40" w:before="0"/>
+      </w:pPr>
+      <w:r>
+        <w:rPr>
+          <w:rFonts w:ascii="Calibri" w:hAnsi="Calibri" w:eastAsia="Calibri"/>
+          <w:b w:val="0"/>
+          <w:sz w:val="22"/>
+        </w:rPr>
+        <w:t xml:space="preserve">  2. Já paguei  (≤25 caracteres)</w:t>
+      </w:r>
+    </w:p>
+    <w:p>
+      <w:pPr>
+        <w:spacing w:after="40" w:before="0"/>
+      </w:pPr>
+      <w:r>
+        <w:rPr>
+          <w:rFonts w:ascii="Calibri" w:hAnsi="Calibri" w:eastAsia="Calibri"/>
+          <w:b w:val="0"/>
+          <w:sz w:val="22"/>
+        </w:rPr>
+        <w:t xml:space="preserve">  3. Falar com suporte  (≤25 caracteres)</w:t>
+      </w:r>
+    </w:p>
+    <w:p>
+      <w:pPr>
+        <w:spacing w:after="120" w:before="0"/>
+      </w:pPr>
+      <w:r>
+        <w:rPr>
+          <w:rFonts w:ascii="Calibri" w:hAnsi="Calibri" w:eastAsia="Calibri"/>
+          <w:b/>
+          <w:sz w:val="22"/>
+        </w:rPr>
+        <w:t>Variáveis (CRM):</w:t>
+      </w:r>
+    </w:p>
+    <w:p>
+      <w:pPr>
+        <w:spacing w:after="40" w:before="0"/>
+      </w:pPr>
+      <w:r>
+        <w:rPr>
+          <w:rFonts w:ascii="Calibri" w:hAnsi="Calibri" w:eastAsia="Calibri"/>
+          <w:b w:val="0"/>
+          <w:sz w:val="22"/>
+        </w:rPr>
+        <w:t>• {{1}} saudação</w:t>
+      </w:r>
+    </w:p>
+    <w:p>
+      <w:pPr>
+        <w:spacing w:after="40" w:before="0"/>
+      </w:pPr>
+      <w:r>
+        <w:rPr>
+          <w:rFonts w:ascii="Calibri" w:hAnsi="Calibri" w:eastAsia="Calibri"/>
+          <w:b w:val="0"/>
+          <w:sz w:val="22"/>
+        </w:rPr>
+        <w:t>• {{2}} primeiro nome</w:t>
+      </w:r>
+    </w:p>
+    <w:p>
+      <w:pPr>
+        <w:spacing w:after="40" w:before="0"/>
+      </w:pPr>
+      <w:r>
+        <w:rPr>
+          <w:rFonts w:ascii="Calibri" w:hAnsi="Calibri" w:eastAsia="Calibri"/>
+          <w:b w:val="0"/>
+          <w:sz w:val="22"/>
+        </w:rPr>
+        <w:t>• {{3}} referência da fatura</w:t>
+      </w:r>
+    </w:p>
+    <w:p>
+      <w:pPr>
+        <w:spacing w:after="40" w:before="0"/>
+      </w:pPr>
+      <w:r>
+        <w:rPr>
+          <w:rFonts w:ascii="Calibri" w:hAnsi="Calibri" w:eastAsia="Calibri"/>
+          <w:b w:val="0"/>
+          <w:sz w:val="22"/>
+        </w:rPr>
+        <w:t>• {{4}} valor</w:t>
+      </w:r>
+    </w:p>
+    <w:p>
+      <w:pPr>
+        <w:spacing w:after="40" w:before="0"/>
+      </w:pPr>
+      <w:r>
+        <w:rPr>
+          <w:rFonts w:ascii="Calibri" w:hAnsi="Calibri" w:eastAsia="Calibri"/>
+          <w:b w:val="0"/>
+          <w:sz w:val="22"/>
+        </w:rPr>
+        <w:t>• {{5}} data de vencimento</w:t>
+      </w:r>
+    </w:p>
+    <w:p>
+      <w:pPr>
+        <w:spacing w:after="120" w:before="0"/>
+      </w:pPr>
+      <w:r>
+        <w:rPr>
+          <w:rFonts w:ascii="Calibri" w:hAnsi="Calibri" w:eastAsia="Calibri"/>
+          <w:b/>
+          <w:sz w:val="22"/>
+        </w:rPr>
+        <w:t>Notas:</w:t>
+      </w:r>
+    </w:p>
+    <w:p>
+      <w:pPr>
+        <w:spacing w:after="40" w:before="0"/>
+      </w:pPr>
+      <w:r>
+        <w:rPr>
+          <w:rFonts w:ascii="Calibri" w:hAnsi="Calibri" w:eastAsia="Calibri"/>
+          <w:b w:val="0"/>
+          <w:sz w:val="22"/>
+        </w:rPr>
+        <w:t>• Não citar SPC/Serasa, negativação ou “prazo de 2 dias antes do encaminhamento” no corpo — a Meta recusa UTILITY com tom de ameaça.</w:t>
+      </w:r>
+    </w:p>
+    <w:p>
+      <w:pPr>
+        <w:spacing w:after="40" w:before="0"/>
+      </w:pPr>
+      <w:r>
+        <w:rPr>
+          <w:rFonts w:ascii="Calibri" w:hAnsi="Calibri" w:eastAsia="Calibri"/>
+          <w:b w:val="0"/>
+          <w:sz w:val="22"/>
+        </w:rPr>
+        <w:t>• Notificação legal de órgãos de proteção ao crédito: enviar em texto livre depois que o cliente responder (janela 24h).</w:t>
+      </w:r>
+    </w:p>
+    <w:p>
+      <w:pPr>
+        <w:spacing w:after="40" w:before="0"/>
+      </w:pPr>
+      <w:r>
+        <w:rPr>
+          <w:rFonts w:ascii="Calibri" w:hAnsi="Calibri" w:eastAsia="Calibri"/>
+          <w:b w:val="0"/>
+          <w:sz w:val="22"/>
+        </w:rPr>
+        <w:t>• CRM: Informar previsão → pede data (promessa de pagamento); Já paguei → comprovante/análise; Falar com suporte → fila humana.</w:t>
+      </w:r>
+    </w:p>
+    <w:p>
+      <w:pPr>
+        <w:spacing w:after="40" w:before="0"/>
+      </w:pPr>
+      <w:r>
+        <w:rPr>
+          <w:rFonts w:ascii="Calibri" w:hAnsi="Calibri" w:eastAsia="Calibri"/>
+          <w:b w:val="0"/>
+          <w:sz w:val="22"/>
+        </w:rPr>
+        <w:t>• Amostra: Bom dia / Maria / Agosto/2026 / R$ 99,90 / 10/08/2026.</w:t>
+      </w:r>
+    </w:p>
+    <w:p/>
+    <w:p>
+      <w:pPr>
         <w:pStyle w:val="Heading1"/>
       </w:pPr>
       <w:r>
@@ -4788,6 +5367,19 @@
           <w:sz w:val="22"/>
         </w:rPr>
         <w:t>• Já paguei → solicita comprovante / fila de baixa</w:t>
+      </w:r>
+    </w:p>
+    <w:p>
+      <w:pPr>
+        <w:spacing w:after="120" w:before="0"/>
+      </w:pPr>
+      <w:r>
+        <w:rPr>
+          <w:rFonts w:ascii="Calibri" w:hAnsi="Calibri" w:eastAsia="Calibri"/>
+          <w:b w:val="0"/>
+          <w:sz w:val="22"/>
+        </w:rPr>
+        <w:t>• Informar previsão → pede data de pagamento (promessa)</w:t>
       </w:r>
     </w:p>
     <w:p>

</xml_diff>